<commit_message>
Cardiac OSCE chart: each 12-lead is headed by its condition's name
Jaxon: "Put the name of the disease/disorder that is associated with the EKGs".
The condition now heads every ECG caption (and its alt text), so it also shows
in the click-to-enlarge view, which reads the figure caption, and in the Word
copy. Finding titles that repeated the name were shortened.

Co-Authored-By: Claude Opus 5.5 <noreply@anthropic.com>
</commit_message>
<xml_diff>
--- a/Physical Diagnosis 2 Exam 1/pd2-cardiac-osce-chart.docx
+++ b/Physical Diagnosis 2 Exam 1/pd2-cardiac-osce-chart.docx
@@ -1642,7 +1642,21 @@
                 <w:i w:val="0"/>
                 <w:sz w:val="18"/>
               </w:rPr>
-              <w:t>What the 12-lead electrocardiogram shows</w:t>
+              <w:t>12-lead electrocardiogram</w:t>
+            </w:r>
+            <w:r>
+              <w:rPr>
+                <w:sz w:val="18"/>
+              </w:rPr>
+              <w:br/>
+            </w:r>
+            <w:r>
+              <w:rPr>
+                <w:b w:val="0"/>
+                <w:i w:val="0"/>
+                <w:sz w:val="18"/>
+              </w:rPr>
+              <w:t>Primary hypertension</w:t>
             </w:r>
             <w:r>
               <w:rPr>
@@ -2809,7 +2823,21 @@
                 <w:i w:val="0"/>
                 <w:sz w:val="18"/>
               </w:rPr>
-              <w:t>What the 12-lead electrocardiogram shows</w:t>
+              <w:t>12-lead electrocardiogram</w:t>
+            </w:r>
+            <w:r>
+              <w:rPr>
+                <w:sz w:val="18"/>
+              </w:rPr>
+              <w:br/>
+            </w:r>
+            <w:r>
+              <w:rPr>
+                <w:b w:val="0"/>
+                <w:i w:val="0"/>
+                <w:sz w:val="18"/>
+              </w:rPr>
+              <w:t>Peripheral artery disease</w:t>
             </w:r>
             <w:r>
               <w:rPr>
@@ -3584,7 +3612,21 @@
                 <w:i w:val="0"/>
                 <w:sz w:val="18"/>
               </w:rPr>
-              <w:t>What the 12-lead electrocardiogram shows</w:t>
+              <w:t>12-lead electrocardiogram</w:t>
+            </w:r>
+            <w:r>
+              <w:rPr>
+                <w:sz w:val="18"/>
+              </w:rPr>
+              <w:br/>
+            </w:r>
+            <w:r>
+              <w:rPr>
+                <w:b w:val="0"/>
+                <w:i w:val="0"/>
+                <w:sz w:val="18"/>
+              </w:rPr>
+              <w:t>Chronic heart failure</w:t>
             </w:r>
             <w:r>
               <w:rPr>
@@ -4215,15 +4257,29 @@
                 <w:i w:val="0"/>
                 <w:sz w:val="18"/>
               </w:rPr>
-              <w:t>What the 12-lead electrocardiogram shows</w:t>
-            </w:r>
-            <w:r>
-              <w:rPr>
-                <w:b/>
-                <w:i w:val="0"/>
-                <w:sz w:val="18"/>
-              </w:rPr>
-              <w:t>Premature ventricular contractions in bigeminy</w:t>
+              <w:t>12-lead electrocardiogram</w:t>
+            </w:r>
+            <w:r>
+              <w:rPr>
+                <w:sz w:val="18"/>
+              </w:rPr>
+              <w:br/>
+            </w:r>
+            <w:r>
+              <w:rPr>
+                <w:b w:val="0"/>
+                <w:i w:val="0"/>
+                <w:sz w:val="18"/>
+              </w:rPr>
+              <w:t>Premature ventricular contractions</w:t>
+            </w:r>
+            <w:r>
+              <w:rPr>
+                <w:b/>
+                <w:i w:val="0"/>
+                <w:sz w:val="18"/>
+              </w:rPr>
+              <w:t>Bigeminy: every other beat is premature</w:t>
             </w:r>
             <w:r>
               <w:rPr>
@@ -4838,7 +4894,21 @@
                 <w:i w:val="0"/>
                 <w:sz w:val="18"/>
               </w:rPr>
-              <w:t>What the 12-lead electrocardiogram shows</w:t>
+              <w:t>12-lead electrocardiogram</w:t>
+            </w:r>
+            <w:r>
+              <w:rPr>
+                <w:sz w:val="18"/>
+              </w:rPr>
+              <w:br/>
+            </w:r>
+            <w:r>
+              <w:rPr>
+                <w:b w:val="0"/>
+                <w:i w:val="0"/>
+                <w:sz w:val="18"/>
+              </w:rPr>
+              <w:t>Vasovagal syncope</w:t>
             </w:r>
             <w:r>
               <w:rPr>
@@ -5493,7 +5563,21 @@
                 <w:i w:val="0"/>
                 <w:sz w:val="18"/>
               </w:rPr>
-              <w:t>What the 12-lead electrocardiogram shows</w:t>
+              <w:t>12-lead electrocardiogram</w:t>
+            </w:r>
+            <w:r>
+              <w:rPr>
+                <w:sz w:val="18"/>
+              </w:rPr>
+              <w:br/>
+            </w:r>
+            <w:r>
+              <w:rPr>
+                <w:b w:val="0"/>
+                <w:i w:val="0"/>
+                <w:sz w:val="18"/>
+              </w:rPr>
+              <w:t>Mitral regurgitation</w:t>
             </w:r>
             <w:r>
               <w:rPr>
@@ -6116,7 +6200,21 @@
                 <w:i w:val="0"/>
                 <w:sz w:val="18"/>
               </w:rPr>
-              <w:t>What the 12-lead electrocardiogram shows</w:t>
+              <w:t>12-lead electrocardiogram</w:t>
+            </w:r>
+            <w:r>
+              <w:rPr>
+                <w:sz w:val="18"/>
+              </w:rPr>
+              <w:br/>
+            </w:r>
+            <w:r>
+              <w:rPr>
+                <w:b w:val="0"/>
+                <w:i w:val="0"/>
+                <w:sz w:val="18"/>
+              </w:rPr>
+              <w:t>Mitral valve prolapse</w:t>
             </w:r>
             <w:r>
               <w:rPr>
@@ -6787,7 +6885,21 @@
                 <w:i w:val="0"/>
                 <w:sz w:val="18"/>
               </w:rPr>
-              <w:t>What the 12-lead electrocardiogram shows</w:t>
+              <w:t>12-lead electrocardiogram</w:t>
+            </w:r>
+            <w:r>
+              <w:rPr>
+                <w:sz w:val="18"/>
+              </w:rPr>
+              <w:br/>
+            </w:r>
+            <w:r>
+              <w:rPr>
+                <w:b w:val="0"/>
+                <w:i w:val="0"/>
+                <w:sz w:val="18"/>
+              </w:rPr>
+              <w:t>Orthostatic hypotension</w:t>
             </w:r>
             <w:r>
               <w:rPr>
@@ -7886,7 +7998,21 @@
                 <w:i w:val="0"/>
                 <w:sz w:val="18"/>
               </w:rPr>
-              <w:t>What the 12-lead electrocardiogram shows</w:t>
+              <w:t>12-lead electrocardiogram</w:t>
+            </w:r>
+            <w:r>
+              <w:rPr>
+                <w:sz w:val="18"/>
+              </w:rPr>
+              <w:br/>
+            </w:r>
+            <w:r>
+              <w:rPr>
+                <w:b w:val="0"/>
+                <w:i w:val="0"/>
+                <w:sz w:val="18"/>
+              </w:rPr>
+              <w:t>Stable angina</w:t>
             </w:r>
             <w:r>
               <w:rPr>
@@ -8525,15 +8651,29 @@
                 <w:i w:val="0"/>
                 <w:sz w:val="18"/>
               </w:rPr>
-              <w:t>What the 12-lead electrocardiogram shows</w:t>
-            </w:r>
-            <w:r>
-              <w:rPr>
-                <w:b/>
-                <w:i w:val="0"/>
-                <w:sz w:val="18"/>
-              </w:rPr>
-              <w:t>Atrial fibrillation, rate controlled</w:t>
+              <w:t>12-lead electrocardiogram</w:t>
+            </w:r>
+            <w:r>
+              <w:rPr>
+                <w:sz w:val="18"/>
+              </w:rPr>
+              <w:br/>
+            </w:r>
+            <w:r>
+              <w:rPr>
+                <w:b w:val="0"/>
+                <w:i w:val="0"/>
+                <w:sz w:val="18"/>
+              </w:rPr>
+              <w:t>Atrial fibrillation</w:t>
+            </w:r>
+            <w:r>
+              <w:rPr>
+                <w:b/>
+                <w:i w:val="0"/>
+                <w:sz w:val="18"/>
+              </w:rPr>
+              <w:t>Rate controlled, at about 90 a minute</w:t>
             </w:r>
             <w:r>
               <w:rPr>
@@ -9788,15 +9928,29 @@
                 <w:i w:val="0"/>
                 <w:sz w:val="18"/>
               </w:rPr>
-              <w:t>What the 12-lead electrocardiogram shows</w:t>
-            </w:r>
-            <w:r>
-              <w:rPr>
-                <w:b/>
-                <w:i w:val="0"/>
-                <w:sz w:val="18"/>
-              </w:rPr>
-              <w:t>Extreme left ventricular hypertrophy from severe aortic stenosis</w:t>
+              <w:t>12-lead electrocardiogram</w:t>
+            </w:r>
+            <w:r>
+              <w:rPr>
+                <w:sz w:val="18"/>
+              </w:rPr>
+              <w:br/>
+            </w:r>
+            <w:r>
+              <w:rPr>
+                <w:b w:val="0"/>
+                <w:i w:val="0"/>
+                <w:sz w:val="18"/>
+              </w:rPr>
+              <w:t>Aortic stenosis</w:t>
+            </w:r>
+            <w:r>
+              <w:rPr>
+                <w:b/>
+                <w:i w:val="0"/>
+                <w:sz w:val="18"/>
+              </w:rPr>
+              <w:t>Extreme left ventricular hypertrophy from severe stenosis</w:t>
             </w:r>
             <w:r>
               <w:rPr>
@@ -10515,15 +10669,29 @@
                 <w:i w:val="0"/>
                 <w:sz w:val="18"/>
               </w:rPr>
-              <w:t>What the 12-lead electrocardiogram shows</w:t>
-            </w:r>
-            <w:r>
-              <w:rPr>
-                <w:b/>
-                <w:i w:val="0"/>
-                <w:sz w:val="18"/>
-              </w:rPr>
-              <w:t>Pericarditis: diffuse ST elevation with PR depression</w:t>
+              <w:t>12-lead electrocardiogram</w:t>
+            </w:r>
+            <w:r>
+              <w:rPr>
+                <w:sz w:val="18"/>
+              </w:rPr>
+              <w:br/>
+            </w:r>
+            <w:r>
+              <w:rPr>
+                <w:b w:val="0"/>
+                <w:i w:val="0"/>
+                <w:sz w:val="18"/>
+              </w:rPr>
+              <w:t>Acute pericarditis</w:t>
+            </w:r>
+            <w:r>
+              <w:rPr>
+                <w:b/>
+                <w:i w:val="0"/>
+                <w:sz w:val="18"/>
+              </w:rPr>
+              <w:t>Diffuse ST elevation with PR depression</w:t>
             </w:r>
             <w:r>
               <w:rPr>
@@ -11218,15 +11386,29 @@
                 <w:i w:val="0"/>
                 <w:sz w:val="18"/>
               </w:rPr>
-              <w:t>What the 12-lead electrocardiogram shows</w:t>
-            </w:r>
-            <w:r>
-              <w:rPr>
-                <w:b/>
-                <w:i w:val="0"/>
-                <w:sz w:val="18"/>
-              </w:rPr>
-              <w:t>Hypertrophic cardiomyopathy (a woman with the obstructive form)</w:t>
+              <w:t>12-lead electrocardiogram</w:t>
+            </w:r>
+            <w:r>
+              <w:rPr>
+                <w:sz w:val="18"/>
+              </w:rPr>
+              <w:br/>
+            </w:r>
+            <w:r>
+              <w:rPr>
+                <w:b w:val="0"/>
+                <w:i w:val="0"/>
+                <w:sz w:val="18"/>
+              </w:rPr>
+              <w:t>Hypertrophic cardiomyopathy</w:t>
+            </w:r>
+            <w:r>
+              <w:rPr>
+                <w:b/>
+                <w:i w:val="0"/>
+                <w:sz w:val="18"/>
+              </w:rPr>
+              <w:t>A woman with the obstructive form</w:t>
             </w:r>
             <w:r>
               <w:rPr>
@@ -12455,15 +12637,29 @@
                 <w:i w:val="0"/>
                 <w:sz w:val="18"/>
               </w:rPr>
-              <w:t>What the 12-lead electrocardiogram shows</w:t>
-            </w:r>
-            <w:r>
-              <w:rPr>
-                <w:b/>
-                <w:i w:val="0"/>
-                <w:sz w:val="18"/>
-              </w:rPr>
-              <w:t>ST-elevation myocardial infarction, anteroseptal</w:t>
+              <w:t>12-lead electrocardiogram</w:t>
+            </w:r>
+            <w:r>
+              <w:rPr>
+                <w:sz w:val="18"/>
+              </w:rPr>
+              <w:br/>
+            </w:r>
+            <w:r>
+              <w:rPr>
+                <w:b w:val="0"/>
+                <w:i w:val="0"/>
+                <w:sz w:val="18"/>
+              </w:rPr>
+              <w:t>Acute coronary syndrome</w:t>
+            </w:r>
+            <w:r>
+              <w:rPr>
+                <w:b/>
+                <w:i w:val="0"/>
+                <w:sz w:val="18"/>
+              </w:rPr>
+              <w:t>Anteroseptal ST-elevation myocardial infarction</w:t>
             </w:r>
             <w:r>
               <w:rPr>
@@ -13126,7 +13322,21 @@
                 <w:i w:val="0"/>
                 <w:sz w:val="18"/>
               </w:rPr>
-              <w:t>What the 12-lead electrocardiogram shows</w:t>
+              <w:t>12-lead electrocardiogram</w:t>
+            </w:r>
+            <w:r>
+              <w:rPr>
+                <w:sz w:val="18"/>
+              </w:rPr>
+              <w:br/>
+            </w:r>
+            <w:r>
+              <w:rPr>
+                <w:b w:val="0"/>
+                <w:i w:val="0"/>
+                <w:sz w:val="18"/>
+              </w:rPr>
+              <w:t>Aortic dissection</w:t>
             </w:r>
             <w:r>
               <w:rPr>
@@ -13757,15 +13967,29 @@
                 <w:i w:val="0"/>
                 <w:sz w:val="18"/>
               </w:rPr>
-              <w:t>What the 12-lead electrocardiogram shows</w:t>
-            </w:r>
-            <w:r>
-              <w:rPr>
-                <w:b/>
-                <w:i w:val="0"/>
-                <w:sz w:val="18"/>
-              </w:rPr>
-              <w:t>Tamponade: low voltage and electrical alternans</w:t>
+              <w:t>12-lead electrocardiogram</w:t>
+            </w:r>
+            <w:r>
+              <w:rPr>
+                <w:sz w:val="18"/>
+              </w:rPr>
+              <w:br/>
+            </w:r>
+            <w:r>
+              <w:rPr>
+                <w:b w:val="0"/>
+                <w:i w:val="0"/>
+                <w:sz w:val="18"/>
+              </w:rPr>
+              <w:t>Cardiac tamponade</w:t>
+            </w:r>
+            <w:r>
+              <w:rPr>
+                <w:b/>
+                <w:i w:val="0"/>
+                <w:sz w:val="18"/>
+              </w:rPr>
+              <w:t>Low voltage and electrical alternans</w:t>
             </w:r>
             <w:r>
               <w:rPr>
@@ -14372,15 +14596,29 @@
                 <w:i w:val="0"/>
                 <w:sz w:val="18"/>
               </w:rPr>
-              <w:t>What the 12-lead electrocardiogram shows</w:t>
-            </w:r>
-            <w:r>
-              <w:rPr>
-                <w:b/>
-                <w:i w:val="0"/>
-                <w:sz w:val="18"/>
-              </w:rPr>
-              <w:t>Monomorphic ventricular tachycardia</w:t>
+              <w:t>12-lead electrocardiogram</w:t>
+            </w:r>
+            <w:r>
+              <w:rPr>
+                <w:sz w:val="18"/>
+              </w:rPr>
+              <w:br/>
+            </w:r>
+            <w:r>
+              <w:rPr>
+                <w:b w:val="0"/>
+                <w:i w:val="0"/>
+                <w:sz w:val="18"/>
+              </w:rPr>
+              <w:t>Ventricular tachycardia</w:t>
+            </w:r>
+            <w:r>
+              <w:rPr>
+                <w:b/>
+                <w:i w:val="0"/>
+                <w:sz w:val="18"/>
+              </w:rPr>
+              <w:t>Monomorphic: every beat the same shape</w:t>
             </w:r>
             <w:r>
               <w:rPr>
@@ -15099,7 +15337,21 @@
                 <w:i w:val="0"/>
                 <w:sz w:val="18"/>
               </w:rPr>
-              <w:t>What the 12-lead electrocardiogram shows</w:t>
+              <w:t>12-lead electrocardiogram</w:t>
+            </w:r>
+            <w:r>
+              <w:rPr>
+                <w:sz w:val="18"/>
+              </w:rPr>
+              <w:br/>
+            </w:r>
+            <w:r>
+              <w:rPr>
+                <w:b w:val="0"/>
+                <w:i w:val="0"/>
+                <w:sz w:val="18"/>
+              </w:rPr>
+              <w:t>Hypertensive emergency</w:t>
             </w:r>
             <w:r>
               <w:rPr>

</xml_diff>

<commit_message>
Cardiac OSCE chart: name the drug after every drug class in Treatment
ACE inhibitor (lisinopril), ARB (losartan), heart-failure beta blockers
(carvedilol, metoprolol succinate, bisoprolol), metoprolol for angina, ACS,
AF and PVCs, atorvastatin/rosuvastatin, enoxaparin, labetalol, furosemide,
diltiazem/verapamil. Each name is taken from a CMS or Pharm slide, cited in
the row's source column.

Co-Authored-By: Claude Opus 5.5 <noreply@anthropic.com>
</commit_message>
<xml_diff>
--- a/Physical Diagnosis 2 Exam 1/pd2-cardiac-osce-chart.docx
+++ b/Physical Diagnosis 2 Exam 1/pd2-cardiac-osce-chart.docx
@@ -1536,7 +1536,7 @@
                 <w:i w:val="0"/>
                 <w:sz w:val="18"/>
               </w:rPr>
-              <w:t>, ideally in one pill — a thiazide-type diuretic (chlorthalidone preferred), an angiotensin-converting enzyme inhibitor or angiotensin receptor blocker (never both), or a dihydropyridine calcium channel blocker (amlodipine).</w:t>
+              <w:t>, ideally in one pill — a thiazide-type diuretic (chlorthalidone preferred), an angiotensin-converting enzyme inhibitor (lisinopril) or angiotensin receptor blocker (losartan), never both, or a dihydropyridine calcium channel blocker (amlodipine).</w:t>
             </w:r>
             <w:r>
               <w:rPr>
@@ -2693,7 +2693,7 @@
                 <w:i w:val="0"/>
                 <w:sz w:val="18"/>
               </w:rPr>
-              <w:t xml:space="preserve"> (30 to 45 minutes, three times a week). Antiplatelet therapy (aspirin or clopidogrel) and cilostazol; a statin. Revascularization (angioplasty with or without a stent, atherectomy, bypass, endarterectomy) when claudication stays disabling despite exercise and drugs. Rest pain, a nonhealing ulcer or gangrene → vascular surgery.</w:t>
+              <w:t xml:space="preserve"> (30 to 45 minutes, three times a week). Antiplatelet therapy (aspirin or clopidogrel) and cilostazol; a statin (simvastatin or pravastatin). Revascularization (angioplasty with or without a stent, atherectomy, bypass, endarterectomy) when claudication stays disabling despite exercise and drugs. Rest pain, a nonhealing ulcer or gangrene → vascular surgery.</w:t>
             </w:r>
             <w:r>
               <w:rPr>
@@ -2970,7 +2970,7 @@
                 <w:i w:val="0"/>
                 <w:sz w:val="18"/>
               </w:rPr>
-              <w:t>Clinical Medicine Lecture 25 Heart Failure (Carter) · slides 5, 6, 8–10, 18, 24, 26, 29, 30, 32–34, 38–40, 52–54, 56 · Clinical Medicine Lecture 20 Hypertension slides 20, 57 · Clinical Medicine Lecture 26 Venous Disorders (Shah) slides 14, 26–29 · Physical Diagnosis 2 Cardiovascular slides 7, 8, 20, 23, 40, 42, 88, 89</w:t>
+              <w:t>Clinical Medicine Lecture 25 Heart Failure (Carter) · slides 5, 6, 8–10, 18, 24, 26, 29, 30, 32–34, 38–40, 52–54, 56 · Clinical Medicine Lecture 20 Hypertension slides 20, 57 · Clinical Medicine Lecture 26 Venous Disorders (Shah) slides 14, 26–29 · Physical Diagnosis 2 Cardiovascular slides 7, 8, 20, 23, 40, 42, 88, 89 · Pharm Antihypertensives slide 70</w:t>
             </w:r>
           </w:p>
         </w:tc>
@@ -3458,7 +3458,7 @@
                 <w:i w:val="0"/>
                 <w:sz w:val="18"/>
               </w:rPr>
-              <w:t xml:space="preserve">. Reduced (≤40%): an angiotensin receptor-neprilysin inhibitor (sacubitril-valsartan) or an angiotensin-converting enzyme inhibitor or angiotensin receptor blocker, a </w:t>
+              <w:t xml:space="preserve">. Reduced (≤40%): an angiotensin receptor-neprilysin inhibitor (sacubitril-valsartan) or an angiotensin-converting enzyme inhibitor (lisinopril) or angiotensin receptor blocker (losartan), a </w:t>
             </w:r>
             <w:r>
               <w:rPr>
@@ -3474,7 +3474,7 @@
                 <w:i w:val="0"/>
                 <w:sz w:val="18"/>
               </w:rPr>
-              <w:t xml:space="preserve">, a mineralocorticoid receptor antagonist (spironolactone), a sodium-glucose cotransporter 2 inhibitor (dapagliflozin) and a loop diuretic (furosemide) as needed; hydralazine with isosorbide dinitrate for African American patients in New York Heart Association class III–IV; </w:t>
+              <w:t xml:space="preserve"> (carvedilol, metoprolol succinate or bisoprolol), a mineralocorticoid receptor antagonist (spironolactone), a sodium-glucose cotransporter 2 inhibitor (dapagliflozin) and a loop diuretic (furosemide) as needed; hydralazine with isosorbide dinitrate for African American patients in New York Heart Association class III–IV; </w:t>
             </w:r>
             <w:r>
               <w:rPr>
@@ -3759,7 +3759,7 @@
                 <w:i w:val="0"/>
                 <w:sz w:val="18"/>
               </w:rPr>
-              <w:t>Clinical Medicine Lecture 30 Arrhythmias II: Blocks and Ventriculars (Elwaya) · slides 33, 35, 36, 40 · Clinical Medicine Lecture 29 slides 46, 54, 56 · Physical Diagnosis 2 Cardiovascular slides 6, 30, 99</w:t>
+              <w:t>Clinical Medicine Lecture 30 Arrhythmias II: Blocks and Ventriculars (Elwaya) · slides 33, 35, 36, 40 · Clinical Medicine Lecture 29 slides 46, 54, 56 · Physical Diagnosis 2 Cardiovascular slides 6, 30, 99 · Pharm Antiarrhythmics slides 27, 29</w:t>
             </w:r>
           </w:p>
         </w:tc>
@@ -4127,7 +4127,7 @@
                 <w:i w:val="0"/>
                 <w:sz w:val="18"/>
               </w:rPr>
-              <w:t>, catheter ablation if refractory or not tolerated. High-risk (burden over 15%, induced cardiomyopathy, structural or conduction disease, past syncope) → beta blocker and optimized treatment of the heart disease, or ablation for an isolated induced cardiomyopathy with heart failure; refer to cardiology.</w:t>
+              <w:t xml:space="preserve"> (metoprolol), catheter ablation if refractory or not tolerated. High-risk (burden over 15%, induced cardiomyopathy, structural or conduction disease, past syncope) → beta blocker and optimized treatment of the heart disease, or ablation for an isolated induced cardiomyopathy with heart failure; refer to cardiology.</w:t>
             </w:r>
             <w:r>
               <w:rPr>
@@ -7436,7 +7436,7 @@
                 <w:i w:val="0"/>
                 <w:sz w:val="18"/>
               </w:rPr>
-              <w:t>Clinical Medicine Lecture 24 Coronary Artery Disease · slides 22–23, 27–32, 35, 37–41, 45–46, 72a, 79 · Clinical Medicine Lecture 23 Valvular Heart Disease slides 16–17 · Physical Diagnosis 2 Cardiovascular slides 5, 42, 67, 96–97</w:t>
+              <w:t>Clinical Medicine Lecture 24 Coronary Artery Disease · slides 22–23, 27–32, 35, 37–41, 45–46, 72a, 79 · Clinical Medicine Lecture 23 Valvular Heart Disease slides 16–17 · Physical Diagnosis 2 Cardiovascular slides 5, 42, 67, 96–97 · Clinical Medicine Lecture 22 slide 79 · Pharm Myocardial Ischemia Drugs slide 17 · Pharm Antihypertensives slide 49</w:t>
             </w:r>
           </w:p>
         </w:tc>
@@ -7852,7 +7852,7 @@
                 <w:i w:val="0"/>
                 <w:sz w:val="18"/>
               </w:rPr>
-              <w:t xml:space="preserve"> (a calcium channel blocker if a beta blocker is contraindicated), </w:t>
+              <w:t xml:space="preserve"> (metoprolol; a calcium channel blocker such as amlodipine if a beta blocker is contraindicated), </w:t>
             </w:r>
             <w:r>
               <w:rPr>
@@ -7868,7 +7868,7 @@
                 <w:i w:val="0"/>
                 <w:sz w:val="18"/>
               </w:rPr>
-              <w:t xml:space="preserve"> and </w:t>
+              <w:t xml:space="preserve"> (atorvastatin) and </w:t>
             </w:r>
             <w:r>
               <w:rPr>
@@ -8145,7 +8145,7 @@
                 <w:i w:val="0"/>
                 <w:sz w:val="18"/>
               </w:rPr>
-              <w:t>Clinical Medicine Lecture 29 Arrhythmias I: Supraventricular (Elwaya) · slides 24, 28, 32, 42, 46–50, 56, 58 · Physical Diagnosis 2 Cardiovascular slides 6, 30, 99</w:t>
+              <w:t>Clinical Medicine Lecture 29 Arrhythmias I: Supraventricular (Elwaya) · slides 24, 28, 32, 42, 46–50, 56, 58 · Physical Diagnosis 2 Cardiovascular slides 6, 30, 99 · Pharm Antiarrhythmics slides 29, 39</w:t>
             </w:r>
           </w:p>
         </w:tc>
@@ -8489,7 +8489,7 @@
                 <w:i w:val="0"/>
                 <w:sz w:val="18"/>
               </w:rPr>
-              <w:t xml:space="preserve"> Stable with rapid ventricular response → intravenous rate control; stable without it → </w:t>
+              <w:t xml:space="preserve"> Stable with rapid ventricular response → intravenous rate control (diltiazem or metoprolol); stable without it → </w:t>
             </w:r>
             <w:r>
               <w:rPr>
@@ -8505,7 +8505,7 @@
                 <w:i w:val="0"/>
                 <w:sz w:val="18"/>
               </w:rPr>
-              <w:t xml:space="preserve"> (a beta blocker or a nondihydropyridine calcium channel blocker) — rate, not rhythm, is goal one. Anticoagulate by stroke risk: direct oral anticoagulants preferred if nonvalvular (dabigatran, apixaban, edoxaban, rivaroxaban), or warfarin to an international normalized ratio of 2 to 3; the slide says a HAS-BLED of 3 or more means no anticoagulation (guidelines treat it as bleeding risk to fix, not a bar). Outpatient cardioversion only after </w:t>
+              <w:t xml:space="preserve"> (a beta blocker such as metoprolol, or a nondihydropyridine calcium channel blocker, diltiazem or verapamil) — rate, not rhythm, is goal one. Anticoagulate by stroke risk: direct oral anticoagulants preferred if nonvalvular (dabigatran, apixaban, edoxaban, rivaroxaban), or warfarin to an international normalized ratio of 2 to 3; the slide says a HAS-BLED of 3 or more means no anticoagulation (guidelines treat it as bleeding risk to fix, not a bar). Outpatient cardioversion only after </w:t>
             </w:r>
             <w:r>
               <w:rPr>
@@ -9198,7 +9198,7 @@
                 <w:i w:val="0"/>
                 <w:sz w:val="18"/>
               </w:rPr>
-              <w:t xml:space="preserve">: rivaroxaban or apixaban alone, or low molecular weight heparin or fondaparinux followed by dabigatran or edoxaban, or overlapped with warfarin. At least 3 months for a first clot (3 if provoked by a major transient factor, 3 to 6 if minor, indefinite if unprovoked). Outpatient if stable, low bleeding risk, normal kidneys and reliable; </w:t>
+              <w:t xml:space="preserve">: rivaroxaban or apixaban alone, or low molecular weight heparin (enoxaparin) or fondaparinux followed by dabigatran or edoxaban, or overlapped with warfarin. At least 3 months for a first clot (3 if provoked by a major transient factor, 3 to 6 if minor, indefinite if unprovoked). Outpatient if stable, low bleeding risk, normal kidneys and reliable; </w:t>
             </w:r>
             <w:r>
               <w:rPr>
@@ -11939,7 +11939,7 @@
                 <w:i w:val="0"/>
                 <w:sz w:val="18"/>
               </w:rPr>
-              <w:t>Clinical Medicine Lecture 24 Coronary Artery Disease · slides 11, 20, 28–32, 45–53, 63, 65–68, 71–74, 78, 81–85, supplement slide 72a · Clinical Medicine Lecture 27 Arterial Occlusive and Aneurysm slides 114–117 · Clinical Medicine Lecture 31 Pericardial Disease slides 13, 17, 19 · Physical Diagnosis 2 Cardiovascular slides 5, 42, 59</w:t>
+              <w:t>Clinical Medicine Lecture 24 Coronary Artery Disease · slides 11, 20, 28–32, 45–53, 63, 65–68, 71–74, 78, 81–85, supplement slide 72a · Clinical Medicine Lecture 27 Arterial Occlusive and Aneurysm slides 114–117 · Clinical Medicine Lecture 31 Pericardial Disease slides 13, 17, 19 · Physical Diagnosis 2 Cardiovascular slides 5, 42, 59 · Pharm Myocardial Ischemia Drugs slide 17</w:t>
             </w:r>
           </w:p>
         </w:tc>
@@ -12491,7 +12491,7 @@
                 <w:i w:val="0"/>
                 <w:sz w:val="18"/>
               </w:rPr>
-              <w:t xml:space="preserve"> or after a phosphodiesterase inhibitor; beta blocker if no bradycardia; clopidogrel, ticagrelor or prasugrel plus heparin. ST elevation: catheterization team, </w:t>
+              <w:t xml:space="preserve"> or after a phosphodiesterase inhibitor; beta blocker (metoprolol) if no bradycardia; clopidogrel, ticagrelor or prasugrel plus heparin. ST elevation: catheterization team, </w:t>
             </w:r>
             <w:r>
               <w:rPr>
@@ -12507,7 +12507,7 @@
                 <w:i w:val="0"/>
                 <w:sz w:val="18"/>
               </w:rPr>
-              <w:t>, or thrombolytics (tenecteplase) within 30 minutes of arrival if intervention is 2 or more hours away. Non-ST elevation: stabilize, then catheterization, early if the Thrombolysis in Myocardial Infarction score is 3 or more. Discharge on a high-intensity statin and aspirin.</w:t>
+              <w:t>, or thrombolytics (tenecteplase) within 30 minutes of arrival if intervention is 2 or more hours away. Non-ST elevation: stabilize, then catheterization, early if the Thrombolysis in Myocardial Infarction score is 3 or more. Discharge on a high-intensity statin (atorvastatin or rosuvastatin) and aspirin.</w:t>
             </w:r>
             <w:r>
               <w:rPr>
@@ -14759,7 +14759,7 @@
                 <w:i w:val="0"/>
                 <w:sz w:val="18"/>
               </w:rPr>
-              <w:t>Clinical Medicine Lecture 20 Hypertension (Jaquith) · slides 5, 20, 27, 29, 37, 39, 40, 42, 44, 49, 59, 69, 75, 76 · Clinical Medicine Lecture 27 Arterial Occlusive Disease and Aneurysm (Carter) · slides 116, 118 · Physical Diagnosis 2 Cardiovascular slides 40, 77, 86, 102</w:t>
+              <w:t>Clinical Medicine Lecture 20 Hypertension (Jaquith) · slides 5, 20, 27, 29, 37, 39, 40, 42, 44, 49, 59, 69, 75, 76 · Clinical Medicine Lecture 27 Arterial Occlusive Disease and Aneurysm (Carter) · slides 116, 118 · Physical Diagnosis 2 Cardiovascular slides 40, 77, 86, 102 · Pharm ANS Pharmacology slide 122 · Pharm Diuretics slide 12</w:t>
             </w:r>
           </w:p>
         </w:tc>
@@ -15207,7 +15207,7 @@
                 <w:i w:val="0"/>
                 <w:sz w:val="18"/>
               </w:rPr>
-              <w:t xml:space="preserve">. Lower mean arterial pressure </w:t>
+              <w:t xml:space="preserve"> (for example labetalol). Lower mean arterial pressure </w:t>
             </w:r>
             <w:r>
               <w:rPr>
@@ -15223,7 +15223,7 @@
                 <w:i w:val="0"/>
                 <w:sz w:val="18"/>
               </w:rPr>
-              <w:t>, toward about 160/100–110 over 2–6 hours, then normal over 24–48 hours (dissection and some strokes excepted). Pulmonary edema: intravenous nitroglycerin or nitroprusside, oxygen, continuous or bilevel positive airway pressure, and a loop diuretic if overloaded.</w:t>
+              <w:t>, toward about 160/100–110 over 2–6 hours, then normal over 24–48 hours (dissection and some strokes excepted). Pulmonary edema: intravenous nitroglycerin or nitroprusside, oxygen, continuous or bilevel positive airway pressure, and a loop diuretic (furosemide) if overloaded.</w:t>
             </w:r>
             <w:r>
               <w:rPr>

</xml_diff>

<commit_message>
Cardiac OSCE chart: a Typical age line under every condition
From the slides wherever a deck gives an age (14 of 20 rows, slide cited
under the line). Where no deck gives one (hypertensive emergency, mitral
regurgitation, PVCs, ventricular tachycardia, pericarditis) or gives no
number (atrial fibrillation), a standard-reference age is shown and
labelled 'Textbook, not on the slides'. Data in tools/_pd2_cardiac_osce_ages.py.

Co-Authored-By: Claude Opus 5.5 <noreply@anthropic.com>
</commit_message>
<xml_diff>
--- a/Physical Diagnosis 2 Exam 1/pd2-cardiac-osce-chart.docx
+++ b/Physical Diagnosis 2 Exam 1/pd2-cardiac-osce-chart.docx
@@ -998,6 +998,42 @@
             </w:r>
             <w:r>
               <w:rPr>
+                <w:b/>
+                <w:i w:val="0"/>
+                <w:sz w:val="18"/>
+              </w:rPr>
+              <w:t>Typical age</w:t>
+            </w:r>
+            <w:r>
+              <w:rPr>
+                <w:b w:val="0"/>
+                <w:i w:val="0"/>
+                <w:sz w:val="18"/>
+              </w:rPr>
+              <w:t xml:space="preserve"> Climbs with every decade: 23% of adults aged 18–39, 53% at 40–59, 72% at 60 and older. </w:t>
+            </w:r>
+            <w:r>
+              <w:rPr>
+                <w:sz w:val="18"/>
+              </w:rPr>
+              <w:br/>
+            </w:r>
+            <w:r>
+              <w:rPr>
+                <w:b w:val="0"/>
+                <w:i w:val="0"/>
+                <w:sz w:val="18"/>
+              </w:rPr>
+              <w:t>Clinical Medicine Lecture 20 slide 8</w:t>
+            </w:r>
+            <w:r>
+              <w:rPr>
+                <w:sz w:val="18"/>
+              </w:rPr>
+              <w:br/>
+            </w:r>
+            <w:r>
+              <w:rPr>
                 <w:b w:val="0"/>
                 <w:i w:val="0"/>
                 <w:sz w:val="18"/>
@@ -1755,6 +1791,42 @@
             </w:r>
             <w:r>
               <w:rPr>
+                <w:b/>
+                <w:i w:val="0"/>
+                <w:sz w:val="18"/>
+              </w:rPr>
+              <w:t>Typical age</w:t>
+            </w:r>
+            <w:r>
+              <w:rPr>
+                <w:b w:val="0"/>
+                <w:i w:val="0"/>
+                <w:sz w:val="18"/>
+              </w:rPr>
+              <w:t xml:space="preserve"> Rises with age (advancing age is its first listed risk factor); women more often than men. </w:t>
+            </w:r>
+            <w:r>
+              <w:rPr>
+                <w:sz w:val="18"/>
+              </w:rPr>
+              <w:br/>
+            </w:r>
+            <w:r>
+              <w:rPr>
+                <w:b w:val="0"/>
+                <w:i w:val="0"/>
+                <w:sz w:val="18"/>
+              </w:rPr>
+              <w:t>Clinical Medicine Lecture 26 slide 8</w:t>
+            </w:r>
+            <w:r>
+              <w:rPr>
+                <w:sz w:val="18"/>
+              </w:rPr>
+              <w:br/>
+            </w:r>
+            <w:r>
+              <w:rPr>
                 <w:b w:val="0"/>
                 <w:i w:val="0"/>
                 <w:sz w:val="18"/>
@@ -2274,6 +2346,42 @@
                 <w:sz w:val="18"/>
               </w:rPr>
               <w:t>Top 10 most common · #4</w:t>
+            </w:r>
+            <w:r>
+              <w:rPr>
+                <w:sz w:val="18"/>
+              </w:rPr>
+              <w:br/>
+            </w:r>
+            <w:r>
+              <w:rPr>
+                <w:b/>
+                <w:i w:val="0"/>
+                <w:sz w:val="18"/>
+              </w:rPr>
+              <w:t>Typical age</w:t>
+            </w:r>
+            <w:r>
+              <w:rPr>
+                <w:b w:val="0"/>
+                <w:i w:val="0"/>
+                <w:sz w:val="18"/>
+              </w:rPr>
+              <w:t xml:space="preserve"> Over 60 with no other risk factors; 50 and older with smoking, diabetes, hypertension or high cholesterol. </w:t>
+            </w:r>
+            <w:r>
+              <w:rPr>
+                <w:sz w:val="18"/>
+              </w:rPr>
+              <w:br/>
+            </w:r>
+            <w:r>
+              <w:rPr>
+                <w:b w:val="0"/>
+                <w:i w:val="0"/>
+                <w:sz w:val="18"/>
+              </w:rPr>
+              <w:t>Clinical Medicine Lecture 27 slide 11</w:t>
             </w:r>
             <w:r>
               <w:rPr>
@@ -2952,6 +3060,42 @@
             </w:r>
             <w:r>
               <w:rPr>
+                <w:b/>
+                <w:i w:val="0"/>
+                <w:sz w:val="18"/>
+              </w:rPr>
+              <w:t>Typical age</w:t>
+            </w:r>
+            <w:r>
+              <w:rPr>
+                <w:b w:val="0"/>
+                <w:i w:val="0"/>
+                <w:sz w:val="18"/>
+              </w:rPr>
+              <w:t xml:space="preserve"> Mostly over 65: 60% of patients with heart failure are older than 65, and 10–15% of people over 80 have it. </w:t>
+            </w:r>
+            <w:r>
+              <w:rPr>
+                <w:sz w:val="18"/>
+              </w:rPr>
+              <w:br/>
+            </w:r>
+            <w:r>
+              <w:rPr>
+                <w:b w:val="0"/>
+                <w:i w:val="0"/>
+                <w:sz w:val="18"/>
+              </w:rPr>
+              <w:t>Clinical Medicine Lecture 25 slide 6</w:t>
+            </w:r>
+            <w:r>
+              <w:rPr>
+                <w:sz w:val="18"/>
+              </w:rPr>
+              <w:br/>
+            </w:r>
+            <w:r>
+              <w:rPr>
                 <w:b w:val="0"/>
                 <w:i w:val="0"/>
                 <w:sz w:val="18"/>
@@ -3725,6 +3869,50 @@
             </w:r>
             <w:r>
               <w:rPr>
+                <w:b/>
+                <w:i w:val="0"/>
+                <w:sz w:val="18"/>
+              </w:rPr>
+              <w:t>Typical age</w:t>
+            </w:r>
+            <w:r>
+              <w:rPr>
+                <w:b w:val="0"/>
+                <w:i w:val="0"/>
+                <w:sz w:val="18"/>
+              </w:rPr>
+              <w:t xml:space="preserve"> </w:t>
+            </w:r>
+            <w:r>
+              <w:rPr>
+                <w:sz w:val="18"/>
+              </w:rPr>
+              <w:br/>
+            </w:r>
+            <w:r>
+              <w:rPr>
+                <w:b w:val="0"/>
+                <w:i w:val="0"/>
+                <w:sz w:val="18"/>
+              </w:rPr>
+              <w:t>Textbook, not on the slides:</w:t>
+            </w:r>
+            <w:r>
+              <w:rPr>
+                <w:b w:val="0"/>
+                <w:i w:val="0"/>
+                <w:sz w:val="18"/>
+              </w:rPr>
+              <w:t xml:space="preserve"> Any age; they become more frequent with age and with heart disease.</w:t>
+            </w:r>
+            <w:r>
+              <w:rPr>
+                <w:sz w:val="18"/>
+              </w:rPr>
+              <w:br/>
+            </w:r>
+            <w:r>
+              <w:rPr>
                 <w:b w:val="0"/>
                 <w:i w:val="0"/>
                 <w:sz w:val="18"/>
@@ -4402,6 +4590,42 @@
             </w:r>
             <w:r>
               <w:rPr>
+                <w:b/>
+                <w:i w:val="0"/>
+                <w:sz w:val="18"/>
+              </w:rPr>
+              <w:t>Typical age</w:t>
+            </w:r>
+            <w:r>
+              <w:rPr>
+                <w:b w:val="0"/>
+                <w:i w:val="0"/>
+                <w:sz w:val="18"/>
+              </w:rPr>
+              <w:t xml:space="preserve"> Young adults, most often young women: reflex syncope causes 85% of fainting before age 40 (and still half of it in the elderly). </w:t>
+            </w:r>
+            <w:r>
+              <w:rPr>
+                <w:sz w:val="18"/>
+              </w:rPr>
+              <w:br/>
+            </w:r>
+            <w:r>
+              <w:rPr>
+                <w:b w:val="0"/>
+                <w:i w:val="0"/>
+                <w:sz w:val="18"/>
+              </w:rPr>
+              <w:t>Clinical Medicine Lecture 21 slide 14</w:t>
+            </w:r>
+            <w:r>
+              <w:rPr>
+                <w:sz w:val="18"/>
+              </w:rPr>
+              <w:br/>
+            </w:r>
+            <w:r>
+              <w:rPr>
                 <w:b w:val="0"/>
                 <w:i w:val="0"/>
                 <w:sz w:val="18"/>
@@ -5023,6 +5247,50 @@
             </w:r>
             <w:r>
               <w:rPr>
+                <w:b/>
+                <w:i w:val="0"/>
+                <w:sz w:val="18"/>
+              </w:rPr>
+              <w:t>Typical age</w:t>
+            </w:r>
+            <w:r>
+              <w:rPr>
+                <w:b w:val="0"/>
+                <w:i w:val="0"/>
+                <w:sz w:val="18"/>
+              </w:rPr>
+              <w:t xml:space="preserve"> </w:t>
+            </w:r>
+            <w:r>
+              <w:rPr>
+                <w:sz w:val="18"/>
+              </w:rPr>
+              <w:br/>
+            </w:r>
+            <w:r>
+              <w:rPr>
+                <w:b w:val="0"/>
+                <w:i w:val="0"/>
+                <w:sz w:val="18"/>
+              </w:rPr>
+              <w:t>Textbook, not on the slides:</w:t>
+            </w:r>
+            <w:r>
+              <w:rPr>
+                <w:b w:val="0"/>
+                <w:i w:val="0"/>
+                <w:sz w:val="18"/>
+              </w:rPr>
+              <w:t xml:space="preserve"> Much more common with age; moderate or severe regurgitation affects about 1 in 10 people over 75.</w:t>
+            </w:r>
+            <w:r>
+              <w:rPr>
+                <w:sz w:val="18"/>
+              </w:rPr>
+              <w:br/>
+            </w:r>
+            <w:r>
+              <w:rPr>
                 <w:b w:val="0"/>
                 <w:i w:val="0"/>
                 <w:sz w:val="18"/>
@@ -5712,6 +5980,42 @@
                 <w:i w:val="0"/>
                 <w:sz w:val="18"/>
               </w:rPr>
+              <w:t>Typical age</w:t>
+            </w:r>
+            <w:r>
+              <w:rPr>
+                <w:b w:val="0"/>
+                <w:i w:val="0"/>
+                <w:sz w:val="18"/>
+              </w:rPr>
+              <w:t xml:space="preserve"> Healthy women aged 15–30. </w:t>
+            </w:r>
+            <w:r>
+              <w:rPr>
+                <w:sz w:val="18"/>
+              </w:rPr>
+              <w:br/>
+            </w:r>
+            <w:r>
+              <w:rPr>
+                <w:b w:val="0"/>
+                <w:i w:val="0"/>
+                <w:sz w:val="18"/>
+              </w:rPr>
+              <w:t>Clinical Medicine Lecture 23 slide 54</w:t>
+            </w:r>
+            <w:r>
+              <w:rPr>
+                <w:sz w:val="18"/>
+              </w:rPr>
+              <w:br/>
+            </w:r>
+            <w:r>
+              <w:rPr>
+                <w:b/>
+                <w:i w:val="0"/>
+                <w:sz w:val="18"/>
+              </w:rPr>
               <w:t>Usually benign and asymptomatic, in healthy women 15–30</w:t>
             </w:r>
             <w:r>
@@ -6320,6 +6624,42 @@
                 <w:sz w:val="18"/>
               </w:rPr>
               <w:t>Top 5 non-emergent · #4</w:t>
+            </w:r>
+            <w:r>
+              <w:rPr>
+                <w:sz w:val="18"/>
+              </w:rPr>
+              <w:br/>
+            </w:r>
+            <w:r>
+              <w:rPr>
+                <w:b/>
+                <w:i w:val="0"/>
+                <w:sz w:val="18"/>
+              </w:rPr>
+              <w:t>Typical age</w:t>
+            </w:r>
+            <w:r>
+              <w:rPr>
+                <w:b w:val="0"/>
+                <w:i w:val="0"/>
+                <w:sz w:val="18"/>
+              </w:rPr>
+              <w:t xml:space="preserve"> Older adults: advanced age is one of its listed causes, alongside low volume and medications. </w:t>
+            </w:r>
+            <w:r>
+              <w:rPr>
+                <w:sz w:val="18"/>
+              </w:rPr>
+              <w:br/>
+            </w:r>
+            <w:r>
+              <w:rPr>
+                <w:b w:val="0"/>
+                <w:i w:val="0"/>
+                <w:sz w:val="18"/>
+              </w:rPr>
+              <w:t>Clinical Medicine Lecture 21 slide 12</w:t>
             </w:r>
             <w:r>
               <w:rPr>
@@ -7402,6 +7742,42 @@
             </w:r>
             <w:r>
               <w:rPr>
+                <w:b/>
+                <w:i w:val="0"/>
+                <w:sz w:val="18"/>
+              </w:rPr>
+              <w:t>Typical age</w:t>
+            </w:r>
+            <w:r>
+              <w:rPr>
+                <w:b w:val="0"/>
+                <w:i w:val="0"/>
+                <w:sz w:val="18"/>
+              </w:rPr>
+              <w:t xml:space="preserve"> Men 45 and older, women 55 and older (the age risk factor); the gap between the sexes closes by about 80. </w:t>
+            </w:r>
+            <w:r>
+              <w:rPr>
+                <w:sz w:val="18"/>
+              </w:rPr>
+              <w:br/>
+            </w:r>
+            <w:r>
+              <w:rPr>
+                <w:b w:val="0"/>
+                <w:i w:val="0"/>
+                <w:sz w:val="18"/>
+              </w:rPr>
+              <w:t>Clinical Medicine Lecture 24 slide 22</w:t>
+            </w:r>
+            <w:r>
+              <w:rPr>
+                <w:sz w:val="18"/>
+              </w:rPr>
+              <w:br/>
+            </w:r>
+            <w:r>
+              <w:rPr>
                 <w:b w:val="0"/>
                 <w:i w:val="0"/>
                 <w:sz w:val="18"/>
@@ -8111,6 +8487,72 @@
             </w:r>
             <w:r>
               <w:rPr>
+                <w:b/>
+                <w:i w:val="0"/>
+                <w:sz w:val="18"/>
+              </w:rPr>
+              <w:t>Typical age</w:t>
+            </w:r>
+            <w:r>
+              <w:rPr>
+                <w:b w:val="0"/>
+                <w:i w:val="0"/>
+                <w:sz w:val="18"/>
+              </w:rPr>
+              <w:t xml:space="preserve"> Older adults (“elderly” is on its risk list). </w:t>
+            </w:r>
+            <w:r>
+              <w:rPr>
+                <w:sz w:val="18"/>
+              </w:rPr>
+              <w:br/>
+            </w:r>
+            <w:r>
+              <w:rPr>
+                <w:b w:val="0"/>
+                <w:i w:val="0"/>
+                <w:sz w:val="18"/>
+              </w:rPr>
+              <w:t>Clinical Medicine Lecture 29 slide 48</w:t>
+            </w:r>
+            <w:r>
+              <w:rPr>
+                <w:b w:val="0"/>
+                <w:i w:val="0"/>
+                <w:sz w:val="18"/>
+              </w:rPr>
+              <w:t xml:space="preserve"> </w:t>
+            </w:r>
+            <w:r>
+              <w:rPr>
+                <w:sz w:val="18"/>
+              </w:rPr>
+              <w:br/>
+            </w:r>
+            <w:r>
+              <w:rPr>
+                <w:b w:val="0"/>
+                <w:i w:val="0"/>
+                <w:sz w:val="18"/>
+              </w:rPr>
+              <w:t>Textbook, not on the slides:</w:t>
+            </w:r>
+            <w:r>
+              <w:rPr>
+                <w:b w:val="0"/>
+                <w:i w:val="0"/>
+                <w:sz w:val="18"/>
+              </w:rPr>
+              <w:t xml:space="preserve"> Rare before 55; about 1 in 10 people over 80.</w:t>
+            </w:r>
+            <w:r>
+              <w:rPr>
+                <w:sz w:val="18"/>
+              </w:rPr>
+              <w:br/>
+            </w:r>
+            <w:r>
+              <w:rPr>
                 <w:b w:val="0"/>
                 <w:i w:val="0"/>
                 <w:sz w:val="18"/>
@@ -8796,6 +9238,42 @@
             </w:r>
             <w:r>
               <w:rPr>
+                <w:b/>
+                <w:i w:val="0"/>
+                <w:sz w:val="18"/>
+              </w:rPr>
+              <w:t>Typical age</w:t>
+            </w:r>
+            <w:r>
+              <w:rPr>
+                <w:b w:val="0"/>
+                <w:i w:val="0"/>
+                <w:sz w:val="18"/>
+              </w:rPr>
+              <w:t xml:space="preserve"> Over 60 (a listed risk factor), or any age with a provoking cause such as surgery or bed rest. </w:t>
+            </w:r>
+            <w:r>
+              <w:rPr>
+                <w:sz w:val="18"/>
+              </w:rPr>
+              <w:br/>
+            </w:r>
+            <w:r>
+              <w:rPr>
+                <w:b w:val="0"/>
+                <w:i w:val="0"/>
+                <w:sz w:val="18"/>
+              </w:rPr>
+              <w:t>Clinical Medicine Lecture 26 slides 50, 64</w:t>
+            </w:r>
+            <w:r>
+              <w:rPr>
+                <w:sz w:val="18"/>
+              </w:rPr>
+              <w:br/>
+            </w:r>
+            <w:r>
+              <w:rPr>
                 <w:b w:val="0"/>
                 <w:i w:val="0"/>
                 <w:sz w:val="18"/>
@@ -9323,6 +9801,42 @@
                 <w:sz w:val="18"/>
               </w:rPr>
               <w:t>Top 10 most common · #10</w:t>
+            </w:r>
+            <w:r>
+              <w:rPr>
+                <w:sz w:val="18"/>
+              </w:rPr>
+              <w:br/>
+            </w:r>
+            <w:r>
+              <w:rPr>
+                <w:b/>
+                <w:i w:val="0"/>
+                <w:sz w:val="18"/>
+              </w:rPr>
+              <w:t>Typical age</w:t>
+            </w:r>
+            <w:r>
+              <w:rPr>
+                <w:b w:val="0"/>
+                <w:i w:val="0"/>
+                <w:sz w:val="18"/>
+              </w:rPr>
+              <w:t xml:space="preserve"> Over 65: present in 25% of people over 65 and 35% over 70. Over 70 the usual cause is degenerative; under 70 it is a bicuspid valve. </w:t>
+            </w:r>
+            <w:r>
+              <w:rPr>
+                <w:sz w:val="18"/>
+              </w:rPr>
+              <w:br/>
+            </w:r>
+            <w:r>
+              <w:rPr>
+                <w:b w:val="0"/>
+                <w:i w:val="0"/>
+                <w:sz w:val="18"/>
+              </w:rPr>
+              <w:t>Clinical Medicine Lecture 23 slides 12–13</w:t>
             </w:r>
             <w:r>
               <w:rPr>
@@ -10073,6 +10587,50 @@
             </w:r>
             <w:r>
               <w:rPr>
+                <w:b/>
+                <w:i w:val="0"/>
+                <w:sz w:val="18"/>
+              </w:rPr>
+              <w:t>Typical age</w:t>
+            </w:r>
+            <w:r>
+              <w:rPr>
+                <w:b w:val="0"/>
+                <w:i w:val="0"/>
+                <w:sz w:val="18"/>
+              </w:rPr>
+              <w:t xml:space="preserve"> </w:t>
+            </w:r>
+            <w:r>
+              <w:rPr>
+                <w:sz w:val="18"/>
+              </w:rPr>
+              <w:br/>
+            </w:r>
+            <w:r>
+              <w:rPr>
+                <w:b w:val="0"/>
+                <w:i w:val="0"/>
+                <w:sz w:val="18"/>
+              </w:rPr>
+              <w:t>Textbook, not on the slides:</w:t>
+            </w:r>
+            <w:r>
+              <w:rPr>
+                <w:b w:val="0"/>
+                <w:i w:val="0"/>
+                <w:sz w:val="18"/>
+              </w:rPr>
+              <w:t xml:space="preserve"> Most often men aged 20 to 50.</w:t>
+            </w:r>
+            <w:r>
+              <w:rPr>
+                <w:sz w:val="18"/>
+              </w:rPr>
+              <w:br/>
+            </w:r>
+            <w:r>
+              <w:rPr>
                 <w:b w:val="0"/>
                 <w:i w:val="0"/>
                 <w:sz w:val="18"/>
@@ -10773,6 +11331,42 @@
                 <w:sz w:val="18"/>
               </w:rPr>
               <w:t>Top 5 non-emergent · #5</w:t>
+            </w:r>
+            <w:r>
+              <w:rPr>
+                <w:sz w:val="18"/>
+              </w:rPr>
+              <w:br/>
+            </w:r>
+            <w:r>
+              <w:rPr>
+                <w:b/>
+                <w:i w:val="0"/>
+                <w:sz w:val="18"/>
+              </w:rPr>
+              <w:t>Typical age</w:t>
+            </w:r>
+            <w:r>
+              <w:rPr>
+                <w:b w:val="0"/>
+                <w:i w:val="0"/>
+                <w:sz w:val="18"/>
+              </w:rPr>
+              <w:t xml:space="preserve"> Any age, but it is the leading cause of sudden death in preadolescents and adolescents, usually during extreme exertion. </w:t>
+            </w:r>
+            <w:r>
+              <w:rPr>
+                <w:sz w:val="18"/>
+              </w:rPr>
+              <w:br/>
+            </w:r>
+            <w:r>
+              <w:rPr>
+                <w:b w:val="0"/>
+                <w:i w:val="0"/>
+                <w:sz w:val="18"/>
+              </w:rPr>
+              <w:t>Clinical Medicine Lecture 28 slides 58, 66</w:t>
             </w:r>
             <w:r>
               <w:rPr>
@@ -11905,6 +12499,42 @@
             </w:r>
             <w:r>
               <w:rPr>
+                <w:b/>
+                <w:i w:val="0"/>
+                <w:sz w:val="18"/>
+              </w:rPr>
+              <w:t>Typical age</w:t>
+            </w:r>
+            <w:r>
+              <w:rPr>
+                <w:b w:val="0"/>
+                <w:i w:val="0"/>
+                <w:sz w:val="18"/>
+              </w:rPr>
+              <w:t xml:space="preserve"> Men 45 and older, women 55 and older; 65 or older adds a point on the TIMI score. </w:t>
+            </w:r>
+            <w:r>
+              <w:rPr>
+                <w:sz w:val="18"/>
+              </w:rPr>
+              <w:br/>
+            </w:r>
+            <w:r>
+              <w:rPr>
+                <w:b w:val="0"/>
+                <w:i w:val="0"/>
+                <w:sz w:val="18"/>
+              </w:rPr>
+              <w:t>Clinical Medicine Lecture 24 slides 22, 71</w:t>
+            </w:r>
+            <w:r>
+              <w:rPr>
+                <w:sz w:val="18"/>
+              </w:rPr>
+              <w:br/>
+            </w:r>
+            <w:r>
+              <w:rPr>
                 <w:b w:val="0"/>
                 <w:i w:val="0"/>
                 <w:sz w:val="18"/>
@@ -12754,6 +13384,42 @@
                 <w:i w:val="0"/>
                 <w:sz w:val="18"/>
               </w:rPr>
+              <w:t>Typical age</w:t>
+            </w:r>
+            <w:r>
+              <w:rPr>
+                <w:b w:val="0"/>
+                <w:i w:val="0"/>
+                <w:sz w:val="18"/>
+              </w:rPr>
+              <w:t xml:space="preserve"> 60s and 70s, men more than women; younger with Marfan syndrome. </w:t>
+            </w:r>
+            <w:r>
+              <w:rPr>
+                <w:sz w:val="18"/>
+              </w:rPr>
+              <w:br/>
+            </w:r>
+            <w:r>
+              <w:rPr>
+                <w:b w:val="0"/>
+                <w:i w:val="0"/>
+                <w:sz w:val="18"/>
+              </w:rPr>
+              <w:t>Clinical Medicine Lecture 27 slide 115</w:t>
+            </w:r>
+            <w:r>
+              <w:rPr>
+                <w:sz w:val="18"/>
+              </w:rPr>
+              <w:br/>
+            </w:r>
+            <w:r>
+              <w:rPr>
+                <w:b/>
+                <w:i w:val="0"/>
+                <w:sz w:val="18"/>
+              </w:rPr>
               <w:t>Acute untreated dissection carries a high mortality</w:t>
             </w:r>
             <w:r>
@@ -13451,6 +14117,42 @@
             </w:r>
             <w:r>
               <w:rPr>
+                <w:b/>
+                <w:i w:val="0"/>
+                <w:sz w:val="18"/>
+              </w:rPr>
+              <w:t>Typical age</w:t>
+            </w:r>
+            <w:r>
+              <w:rPr>
+                <w:b w:val="0"/>
+                <w:i w:val="0"/>
+                <w:sz w:val="18"/>
+              </w:rPr>
+              <w:t xml:space="preserve"> Any age; it follows its cause. In older adults, suspect cancer first. </w:t>
+            </w:r>
+            <w:r>
+              <w:rPr>
+                <w:sz w:val="18"/>
+              </w:rPr>
+              <w:br/>
+            </w:r>
+            <w:r>
+              <w:rPr>
+                <w:b w:val="0"/>
+                <w:i w:val="0"/>
+                <w:sz w:val="18"/>
+              </w:rPr>
+              <w:t>Clinical Medicine Lecture 31 slide 36</w:t>
+            </w:r>
+            <w:r>
+              <w:rPr>
+                <w:sz w:val="18"/>
+              </w:rPr>
+              <w:br/>
+            </w:r>
+            <w:r>
+              <w:rPr>
                 <w:b w:val="0"/>
                 <w:i w:val="0"/>
                 <w:sz w:val="18"/>
@@ -14112,6 +14814,50 @@
             </w:r>
             <w:r>
               <w:rPr>
+                <w:b/>
+                <w:i w:val="0"/>
+                <w:sz w:val="18"/>
+              </w:rPr>
+              <w:t>Typical age</w:t>
+            </w:r>
+            <w:r>
+              <w:rPr>
+                <w:b w:val="0"/>
+                <w:i w:val="0"/>
+                <w:sz w:val="18"/>
+              </w:rPr>
+              <w:t xml:space="preserve"> </w:t>
+            </w:r>
+            <w:r>
+              <w:rPr>
+                <w:sz w:val="18"/>
+              </w:rPr>
+              <w:br/>
+            </w:r>
+            <w:r>
+              <w:rPr>
+                <w:b w:val="0"/>
+                <w:i w:val="0"/>
+                <w:sz w:val="18"/>
+              </w:rPr>
+              <w:t>Textbook, not on the slides:</w:t>
+            </w:r>
+            <w:r>
+              <w:rPr>
+                <w:b w:val="0"/>
+                <w:i w:val="0"/>
+                <w:sz w:val="18"/>
+              </w:rPr>
+              <w:t xml:space="preserve"> Mostly older adults with structural heart disease, above all a prior heart attack.</w:t>
+            </w:r>
+            <w:r>
+              <w:rPr>
+                <w:sz w:val="18"/>
+              </w:rPr>
+              <w:br/>
+            </w:r>
+            <w:r>
+              <w:rPr>
                 <w:b w:val="0"/>
                 <w:i w:val="0"/>
                 <w:sz w:val="18"/>
@@ -14732,6 +15478,50 @@
                 <w:sz w:val="18"/>
               </w:rPr>
               <w:t>Top 5 emergent · #5</w:t>
+            </w:r>
+            <w:r>
+              <w:rPr>
+                <w:sz w:val="18"/>
+              </w:rPr>
+              <w:br/>
+            </w:r>
+            <w:r>
+              <w:rPr>
+                <w:b/>
+                <w:i w:val="0"/>
+                <w:sz w:val="18"/>
+              </w:rPr>
+              <w:t>Typical age</w:t>
+            </w:r>
+            <w:r>
+              <w:rPr>
+                <w:b w:val="0"/>
+                <w:i w:val="0"/>
+                <w:sz w:val="18"/>
+              </w:rPr>
+              <w:t xml:space="preserve"> </w:t>
+            </w:r>
+            <w:r>
+              <w:rPr>
+                <w:sz w:val="18"/>
+              </w:rPr>
+              <w:br/>
+            </w:r>
+            <w:r>
+              <w:rPr>
+                <w:b w:val="0"/>
+                <w:i w:val="0"/>
+                <w:sz w:val="18"/>
+              </w:rPr>
+              <w:t>Textbook, not on the slides:</w:t>
+            </w:r>
+            <w:r>
+              <w:rPr>
+                <w:b w:val="0"/>
+                <w:i w:val="0"/>
+                <w:sz w:val="18"/>
+              </w:rPr>
+              <w:t xml:space="preserve"> Middle-aged and older adults with long-standing, poorly controlled hypertension.</w:t>
             </w:r>
             <w:r>
               <w:rPr>

</xml_diff>